<commit_message>
Rename SMASH to Health Catalyst in base CVs
</commit_message>
<xml_diff>
--- a/Base/Pedro_Gutierrez_CV.docx
+++ b/Base/Pedro_Gutierrez_CV.docx
@@ -572,7 +572,7 @@
           <w:color w:val="222222"/>
           <w:sz w:val="20"/>
         </w:rPr>
-        <w:t>Data Engineer | SMASH Costa Rica</w:t>
+        <w:t>Data Engineer | Health Catalyst</w:t>
       </w:r>
     </w:p>
     <w:p>
@@ -1047,6 +1047,8 @@
     <w:p>
       <w:pPr>
         <w:sectPr>
+          <w:headerReference w:type="default" r:id="rId9"/>
+          <w:footerReference w:type="default" r:id="rId10"/>
           <w:pgSz w:w="12240" w:h="15840"/>
           <w:pgMar w:top="648" w:right="792" w:bottom="648" w:left="792" w:header="720" w:footer="720" w:gutter="0"/>
           <w:cols w:space="720"/>
@@ -1684,6 +1686,26 @@
 </w:document>
 </file>
 
+<file path=word/footer1.xml><?xml version="1.0" encoding="utf-8"?>
+<w:ftr xmlns:m="http://schemas.openxmlformats.org/officeDocument/2006/math" xmlns:mc="http://schemas.openxmlformats.org/markup-compatibility/2006" xmlns:mo="http://schemas.microsoft.com/office/mac/office/2008/main" xmlns:mv="urn:schemas-microsoft-com:mac:vml" xmlns:o="urn:schemas-microsoft-com:office:office" xmlns:r="http://schemas.openxmlformats.org/officeDocument/2006/relationships" xmlns:v="urn:schemas-microsoft-com:vml" xmlns:w10="urn:schemas-microsoft-com:office:word" xmlns:w14="http://schemas.microsoft.com/office/word/2010/wordml" xmlns:w="http://schemas.openxmlformats.org/wordprocessingml/2006/main" xmlns:wne="http://schemas.microsoft.com/office/word/2006/wordml" xmlns:wp14="http://schemas.microsoft.com/office/word/2010/wordprocessingDrawing" xmlns:wp="http://schemas.openxmlformats.org/drawingml/2006/wordprocessingDrawing" xmlns:wpc="http://schemas.microsoft.com/office/word/2010/wordprocessingCanvas" xmlns:wpg="http://schemas.microsoft.com/office/word/2010/wordprocessingGroup" xmlns:wpi="http://schemas.microsoft.com/office/word/2010/wordprocessingInk" xmlns:wps="http://schemas.microsoft.com/office/word/2010/wordprocessingShape" mc:Ignorable="w14 wp14">
+  <w:p>
+    <w:pPr>
+      <w:pStyle w:val="Footer"/>
+    </w:pPr>
+  </w:p>
+</w:ftr>
+</file>
+
+<file path=word/header1.xml><?xml version="1.0" encoding="utf-8"?>
+<w:hdr xmlns:m="http://schemas.openxmlformats.org/officeDocument/2006/math" xmlns:mc="http://schemas.openxmlformats.org/markup-compatibility/2006" xmlns:mo="http://schemas.microsoft.com/office/mac/office/2008/main" xmlns:mv="urn:schemas-microsoft-com:mac:vml" xmlns:o="urn:schemas-microsoft-com:office:office" xmlns:r="http://schemas.openxmlformats.org/officeDocument/2006/relationships" xmlns:v="urn:schemas-microsoft-com:vml" xmlns:w10="urn:schemas-microsoft-com:office:word" xmlns:w14="http://schemas.microsoft.com/office/word/2010/wordml" xmlns:w="http://schemas.openxmlformats.org/wordprocessingml/2006/main" xmlns:wne="http://schemas.microsoft.com/office/word/2006/wordml" xmlns:wp14="http://schemas.microsoft.com/office/word/2010/wordprocessingDrawing" xmlns:wp="http://schemas.openxmlformats.org/drawingml/2006/wordprocessingDrawing" xmlns:wpc="http://schemas.microsoft.com/office/word/2010/wordprocessingCanvas" xmlns:wpg="http://schemas.microsoft.com/office/word/2010/wordprocessingGroup" xmlns:wpi="http://schemas.microsoft.com/office/word/2010/wordprocessingInk" xmlns:wps="http://schemas.microsoft.com/office/word/2010/wordprocessingShape" mc:Ignorable="w14 wp14">
+  <w:p>
+    <w:pPr>
+      <w:pStyle w:val="Header"/>
+    </w:pPr>
+  </w:p>
+</w:hdr>
+</file>
+
 <file path=word/numbering.xml><?xml version="1.0" encoding="utf-8"?>
 <w:numbering xmlns:wpc="http://schemas.microsoft.com/office/word/2010/wordprocessingCanvas" xmlns:mo="http://schemas.microsoft.com/office/mac/office/2008/main" xmlns:mc="http://schemas.openxmlformats.org/markup-compatibility/2006" xmlns:mv="urn:schemas-microsoft-com:mac:vml" xmlns:o="urn:schemas-microsoft-com:office:office" xmlns:r="http://schemas.openxmlformats.org/officeDocument/2006/relationships" xmlns:m="http://schemas.openxmlformats.org/officeDocument/2006/math" xmlns:v="urn:schemas-microsoft-com:vml" xmlns:wp14="http://schemas.microsoft.com/office/word/2010/wordprocessingDrawing" xmlns:wp="http://schemas.openxmlformats.org/drawingml/2006/wordprocessingDrawing" xmlns:w10="urn:schemas-microsoft-com:office:word" xmlns:w="http://schemas.openxmlformats.org/wordprocessingml/2006/main" xmlns:w14="http://schemas.microsoft.com/office/word/2010/wordml" xmlns:wpg="http://schemas.microsoft.com/office/word/2010/wordprocessingGroup" xmlns:wpi="http://schemas.microsoft.com/office/word/2010/wordprocessingInk" xmlns:wne="http://schemas.microsoft.com/office/word/2006/wordml" xmlns:wps="http://schemas.microsoft.com/office/word/2010/wordprocessingShape" mc:Ignorable="w14 wp14">
   <w:abstractNum w:abstractNumId="0">

</xml_diff>

<commit_message>
Add DAX and Power Query to base CVs
</commit_message>
<xml_diff>
--- a/Base/Pedro_Gutierrez_CV.docx
+++ b/Base/Pedro_Gutierrez_CV.docx
@@ -72,7 +72,7 @@
           <w:rFonts w:ascii="Aptos" w:hAnsi="Aptos"/>
           <w:sz w:val="18"/>
         </w:rPr>
-        <w:t>Data Engineer, Snowflake Developer, and SQL Server specialist with 15+ years of experience designing, building, optimizing, and maintaining data solutions across ETL/ELT, data warehousing, BI, reporting, database development, data quality, and AI-assisted analytics workflows. Hands-on experience with Snowflake SQL, dbt models, Snowflake Cortex, MetricFlow semantic layer work, AI-assisted development tools including Cursor and PR review bots, SQL Server, SSIS, SSAS, SSRS, Power BI, Python, PowerShell, Azure, PostgreSQL, MySQL, Salesforce integrations, and Excel. Experienced migrating reporting/business logic into SQL, building silver and gold layer models, optimizing warehouse processing performance, creating reusable data models, and transforming complex datasets into reliable analytics-ready assets for reporting and decision-making.</w:t>
+        <w:t>Data Engineer, Snowflake Developer, and SQL Server specialist with 15+ years of experience designing, building, optimizing, and maintaining data solutions across ETL/ELT, data warehousing, BI, reporting, database development, data quality, and AI-assisted analytics workflows. Hands-on experience with Snowflake SQL, dbt models, Snowflake Cortex, MetricFlow semantic layer work, AI-assisted development tools including Cursor and PR review bots, SQL Server, SSIS, SSAS, SSRS, Power BI, DAX, Power Query, Python, PowerShell, Azure, PostgreSQL, MySQL, Salesforce integrations, and Excel. Experienced migrating reporting/business logic into SQL, building silver and gold layer models, optimizing warehouse processing performance, creating reusable data models, and transforming complex datasets into reliable analytics-ready assets for reporting and decision-making.</w:t>
       </w:r>
     </w:p>
     <w:p>
@@ -237,7 +237,7 @@
                 <w:color w:val="222222"/>
                 <w:sz w:val="16"/>
               </w:rPr>
-              <w:t>Power BI, SSRS, SSAS, Excel, validation checks, anomaly detection, reporting datasets</w:t>
+              <w:t>Power BI, DAX, Power Query, SSRS, SSAS, Excel, validation checks, anomaly detection, reporting datasets</w:t>
             </w:r>
           </w:p>
         </w:tc>
@@ -381,7 +381,7 @@
           <w:rFonts w:ascii="Aptos" w:hAnsi="Aptos"/>
           <w:sz w:val="18"/>
         </w:rPr>
-        <w:t>Microsoft BI Stack: SSIS, SSAS, SSRS, Power BI, Excel, Azure-based environments</w:t>
+        <w:t>Microsoft BI Stack: SSIS, SSAS, SSRS, Power BI, DAX, Power Query, Excel, Azure-based environments</w:t>
       </w:r>
     </w:p>
     <w:p>
@@ -614,7 +614,7 @@
           <w:rFonts w:ascii="Aptos" w:hAnsi="Aptos"/>
           <w:sz w:val="18"/>
         </w:rPr>
-        <w:t>Built and maintained data workflows using SQL Server, SSIS, Python, PowerShell, Snowflake, Power BI, and Excel.</w:t>
+        <w:t>Built and maintained data workflows using SQL Server, SSIS, Python, PowerShell, Snowflake, Power BI, DAX, Power Query, and Excel.</w:t>
       </w:r>
     </w:p>
     <w:p>
@@ -642,7 +642,17 @@
           <w:rFonts w:ascii="Aptos" w:hAnsi="Aptos"/>
           <w:sz w:val="18"/>
         </w:rPr>
-        <w:t>Prepared, cleaned, transformed, and modeled datasets for business reporting, Power BI dashboards, and operational decision-making.</w:t>
+        <w:t>Prepared, cleaned, transformed, and modeled datasets and reporting components for Power BI dashboards and operational decision-making, including DAX measures and Power Query transformations.</w:t>
+      </w:r>
+    </w:p>
+    <w:p>
+      <w:pPr>
+        <w:pStyle w:val="ListBullet"/>
+        <w:spacing w:after="40" w:line="245" w:lineRule="auto"/>
+        <w:ind w:left="259" w:hanging="259"/>
+      </w:pPr>
+      <w:r>
+        <w:t>Worked for six months directly within a Power BI team, developing and supporting dashboards, data models, DAX measures, Power Query transformations, and reporting workflows.</w:t>
       </w:r>
     </w:p>
     <w:p>
@@ -663,7 +673,7 @@
           <w:color w:val="4C4C4C"/>
           <w:sz w:val="17"/>
         </w:rPr>
-        <w:t>SQL Server, SSIS, Power BI, Python, Pandas, NumPy, Matplotlib, PowerShell, Snowflake, Excel</w:t>
+        <w:t>SQL Server, SSIS, Power BI, DAX, Power Query, Python, Pandas, NumPy, Matplotlib, PowerShell, Snowflake, Excel</w:t>
       </w:r>
     </w:p>
     <w:p>
@@ -950,7 +960,7 @@
           <w:color w:val="4C4C4C"/>
           <w:sz w:val="17"/>
         </w:rPr>
-        <w:t>SQL Server, SSIS, SSRS, PostgreSQL, Power BI, Excel</w:t>
+        <w:t>SQL Server, SSIS, SSRS, PostgreSQL, Power BI, DAX, Power Query, Excel</w:t>
       </w:r>
     </w:p>
     <w:p>
@@ -1041,7 +1051,7 @@
           <w:color w:val="4C4C4C"/>
           <w:sz w:val="17"/>
         </w:rPr>
-        <w:t>SQL Server, SSIS, SSAS, Power BI, SSRS, Azure</w:t>
+        <w:t>SQL Server, SSIS, SSAS, Power BI, DAX, Power Query, SSRS, Azure</w:t>
       </w:r>
     </w:p>
     <w:p>
@@ -1147,7 +1157,7 @@
           <w:color w:val="4C4C4C"/>
           <w:sz w:val="17"/>
         </w:rPr>
-        <w:t>SQL Server, SSIS, Azure, MySQL, Power BI</w:t>
+        <w:t>SQL Server, SSIS, Azure, MySQL, Power BI, DAX, Power Query</w:t>
       </w:r>
     </w:p>
     <w:p>

</xml_diff>